<commit_message>
docs: re-baseline frontend execution roadmap and progress ledger (FR-REB-00)
</commit_message>
<xml_diff>
--- a/docs/tasks/Frontend UI redesign/OpenLearn-AI_Integrated_Frontend_Execution_Roadmap_v1.1.docx
+++ b/docs/tasks/Frontend UI redesign/OpenLearn-AI_Integrated_Frontend_Execution_Roadmap_v1.1.docx
@@ -157,7 +157,7 @@
                 <w:sz w:val="24"/>
                 <w:szCs w:val="24"/>
               </w:rPr>
-              <w:t xml:space="preserve">Evidence: Big Pickle maps, verified against the repository (staging @ c51f3f1)</w:t>
+              <w:t>Evidence: Big Pickle maps, verified against the repository (staging @ c51f3f1); re-baselined by batch FR-REB-00 against the current branch (frontend-redesign @ 4c55ecd, containing origin/staging @ d3d5887), 2026-10-08</w:t>
             </w:r>
           </w:p>
           <w:p>
@@ -1914,7 +1914,7 @@
           <w:sz w:val="24"/>
           <w:szCs w:val="24"/>
         </w:rPr>
-        <w:t xml:space="preserve">For the executing developer: Sections 2 and 3 establish what exists and how every finding was bucketed. Sections 4 to 6 define the Week 8 closure, the demo surface, and independence from the AI pod. Section 7 is the integrated flow with its gates. Sections 8 to 13 are the </w:t>
+        <w:t>For the executing developer: Sections 2 and 3 establish what exists and how every finding was bucketed. Sections 4 to 6 define the Week 8 closure, the demo surface, and independence from the AI pod. Section 7 is the integrated flow with its gates. Sections 8 to 13 are the build order — six phases, eighteen batches, each specifying files, changes, protected logic, validation, and completion criteria. Sections 14 to 19 hold the gates, the validation matrix, the out-of-scope list, open questions, and the definition of ready. Sources were applied in the agreed order of authority, with the current repository highest. Version 1.0 was drafted from the two Big Pickle maps; v1.1 was verified against the repository itself (branch staging, HEAD c51f3f1, clean tree), the 44-week plan, and the v1.1 closure roadmap — fifteen batches confirmed exactly as written, three corrected on repository evidence. Batch FR-REB-00 (2026-10-08) then re-baselined the document against the synchronized frontend-redesign branch (HEAD 4c55ecd) after AI Week 7–8 and the documentation relocation changed the system around it; the re-baseline reconciled Sections 2, 4, 5, 6, 8, 16, and 17 with verified repository evidence and left the batch structure, buckets, gates, and stability contract unchanged. The execution ledger now lives in docs/tasks/Frontend UI redesign/OpenLearn-AI_Frontend_Execution_Progress.md. The residual VERIFY steps in batch validation rows mark what only a running system or a named owner can settle (the live F5 datetime answer, the staging CORS preflight confirmation, the Sentry runtime check); each is cross-listed in Section 17. No finding was invented; every item traces to the investigation, to the repository, or to the recorded AI Week 7–8 evidence.</w:t>
       </w:r>
       <w:r>
         <w:rPr>
@@ -1927,7 +1927,6 @@
           <w:sz w:val="24"/>
           <w:szCs w:val="24"/>
         </w:rPr>
-        <w:t xml:space="preserve">build order</w:t>
       </w:r>
       <w:r>
         <w:rPr>
@@ -1940,7 +1939,6 @@
           <w:sz w:val="24"/>
           <w:szCs w:val="24"/>
         </w:rPr>
-        <w:t xml:space="preserve"> — six phases, eighteen batches, each specifying files, changes, protected logic, validation, and completion criteria. Sections 14 to 19 hold the gates, the validation matrix, the out-of-scope list, open questions, and the definition of ready. </w:t>
       </w:r>
       <w:r>
         <w:rPr>
@@ -1953,7 +1951,6 @@
           <w:sz w:val="24"/>
           <w:szCs w:val="24"/>
         </w:rPr>
-        <w:t xml:space="preserve">Sources were applied in the agreed order of authority, with the current repository highest. Version 1.0 was drafted from the two Big Pickle maps; this revision has since been verified against the repository itself (branch staging, HEAD c51f3f1, clean tree), the 44-week plan, and the v1.1 closure roadmap — fifteen batches confirmed exactly as written, three corrected on repository evidence. The residual VERIFY steps in batch validation rows mark what only a running system or a named owner can settle (the live F5 datetime answer, the staging CORS preflight, the Sentry runtime check); each is cross-listed in Section 17. No finding was invented; every item traces to the investigation or to the repository.</w:t>
       </w:r>
     </w:p>
     <w:p>
@@ -1973,7 +1970,7 @@
           <w:sz w:val="24"/>
           <w:szCs w:val="24"/>
         </w:rPr>
-        <w:t xml:space="preserve">Revision record: </w:t>
+        <w:t>Revision record: v1.1 (2026-10-01) folded the verification pass into v1.0: Batch 1.1's S10 defect was widened (the wrong token is invisible in both themes), Batch 1.3's F1 was narrowed (only the Docker/deploy wiring was missing), Batch 3.1 was re-scoped to ratifying the existing token layer, and two additional mislabels (the Active Materials stat card; the Navbar My Materials label) were folded into Batch 2.2. Revision v1.2 (2026-10-08, batch FR-REB-00) is the re-baselining: the frontend-redesign branch was synchronized with origin/staging (AI Week 7–8, PR #77) and the documentation was relocated to docs/tasks/Frontend UI redesign/, so this document was re-verified against the current repository and reconciled where reality had moved. The re-baseline confirmed: the frontend code is unchanged since c51f3f1, so every finding and every batch's file list remains accurate; the material-processing seam is no longer a NotImplementedError stub — the full pipeline (ingest, targeted OCR, chunking, embeddings, pgvector persistence) is implemented and staging-proven, which fires the materials stretch-flow trigger recorded in Sections 5, 6, and 16; the staging compose now passes CORS_ORIGINS including the web origin, retiring the compose-edit escalation in Open Question 3; and the AI HTTP surface is still zero endpoints, so the no-fake-AI rule and the AI exclusions stand. The file name keeps v1.1 for path stability; this in-document revision (v1.2) is the current one. Execution has still not begun; every batch remains NOT STARTED, and the full per-batch evidence, the re-baseline record, and the execution ledger live in docs/tasks/Frontend UI redesign/OpenLearn-AI_Frontend_Execution_Progress.md.</w:t>
       </w:r>
       <w:r>
         <w:rPr>
@@ -1986,7 +1983,6 @@
           <w:sz w:val="24"/>
           <w:szCs w:val="24"/>
         </w:rPr>
-        <w:t xml:space="preserve">v1.1</w:t>
       </w:r>
       <w:r>
         <w:rPr>
@@ -1999,7 +1995,6 @@
           <w:sz w:val="24"/>
           <w:szCs w:val="24"/>
         </w:rPr>
-        <w:t xml:space="preserve"> (this document) folds the verification pass into v1.0. Corrections applied: Batch 1.1's S10 defect is wider than drafted (the wrong token is invisible in both themes, not only dark); Batch 1.3's F1 is narrower (the environment-labeling code layer is already done — only the Docker/deploy wiring is missing); Batch 3.1 is re-scoped from creating a token layer to ratifying the one that already exists and adding the groups it lacks. Two additional mislabels found during the pass (the dashboard stat card labeled Active Materials while showing the course count; the Navbar labeling /courses as My Materials) are folded into Batch 2.2. The full per-batch evidence, the Week 8 mapping delta, and the execution ledger live in </w:t>
       </w:r>
       <w:r>
         <w:rPr>
@@ -2012,7 +2007,6 @@
           <w:sz w:val="24"/>
           <w:szCs w:val="24"/>
         </w:rPr>
-        <w:t xml:space="preserve">frontend/docs/OpenLearn-AI_Frontend_Execution_Progress.md</w:t>
       </w:r>
       <w:r>
         <w:rPr>
@@ -2025,7 +2019,6 @@
           <w:sz w:val="24"/>
           <w:szCs w:val="24"/>
         </w:rPr>
-        <w:t xml:space="preserve">. Execution has not begun; every batch is NOT STARTED.</w:t>
       </w:r>
     </w:p>
     <w:p>
@@ -2098,7 +2091,7 @@
           <w:sz w:val="24"/>
           <w:szCs w:val="24"/>
         </w:rPr>
-        <w:t xml:space="preserve">The baseline is a clean working tree at HEAD </w:t>
+        <w:t>The baseline was a clean working tree at HEAD c51f3f1 when this roadmap was issued; the FR-REB-00 re-baseline (2026-10-08) re-verified it at HEAD 4c55ecd on branch frontend-redesign, which contains origin/staging @ d3d5887 (the AI Week 7–8 integration). The frontend is a Next.js 16.3.1 App Router application with React 19.2.8, TypeScript 5.9.3 strict, Tailwind CSS 4.3.3, keycloak-js 26.2.4 (browser-side OIDC, Authorization Code with PKCE S256, check-sso), and TanStack Query 5. All API traffic flows through a single typed fetch boundary (lib/api.ts), every response is validated by Zod schemas, and the environment is validated once at build time (lib/config.ts). There is no global state library and none is needed: local state plus React Context for authentication is the entire model. Git history between c51f3f1 and 4c55ecd shows zero frontend code changes — only documentation relocation and deletion — so the inventory below stands exactly as verified, and every investigation finding (F, W, S codes) remains open exactly as classified.</w:t>
       </w:r>
       <w:r>
         <w:rPr>
@@ -2111,7 +2104,6 @@
           <w:sz w:val="24"/>
           <w:szCs w:val="24"/>
         </w:rPr>
-        <w:t xml:space="preserve">c51f3f1</w:t>
       </w:r>
       <w:r>
         <w:rPr>
@@ -2124,7 +2116,6 @@
           <w:sz w:val="24"/>
           <w:szCs w:val="24"/>
         </w:rPr>
-        <w:t xml:space="preserve">. The frontend is a Next.js 16.3.1 App Router application with React 19.2.8, TypeScript 5.9.3 strict, Tailwind CSS 4.3.3, keycloak-js 26.2.4 (browser-side OIDC, Authorization Code with PKCE S256, check-sso), and TanStack Query 5. All API traffic flows through a single typed fetch boundary (</w:t>
       </w:r>
       <w:r>
         <w:rPr>
@@ -2137,7 +2128,6 @@
           <w:sz w:val="24"/>
           <w:szCs w:val="24"/>
         </w:rPr>
-        <w:t xml:space="preserve">lib/api.ts</w:t>
       </w:r>
       <w:r>
         <w:rPr>
@@ -2150,7 +2140,6 @@
           <w:sz w:val="24"/>
           <w:szCs w:val="24"/>
         </w:rPr>
-        <w:t xml:space="preserve">), every response is validated by Zod schemas, and the environment is validated once at build time (</w:t>
       </w:r>
       <w:r>
         <w:rPr>
@@ -2163,7 +2152,6 @@
           <w:sz w:val="24"/>
           <w:szCs w:val="24"/>
         </w:rPr>
-        <w:t xml:space="preserve">lib/config.ts</w:t>
       </w:r>
       <w:r>
         <w:rPr>
@@ -2176,7 +2164,6 @@
           <w:sz w:val="24"/>
           <w:szCs w:val="24"/>
         </w:rPr>
-        <w:t xml:space="preserve">). There is no global state library and none is needed: local state plus React Context for authentication is the entire model.</w:t>
       </w:r>
     </w:p>
     <w:p>
@@ -2239,7 +2226,7 @@
           <w:sz w:val="21"/>
           <w:szCs w:val="21"/>
         </w:rPr>
-        <w:t xml:space="preserve">Table 1: </w:t>
+        <w:t>Table 1: Verified frontend inventory (evidence: Big Pickle map; re-confirmed against the repository at c51f3f1; re-verified unchanged by the FR-REB-00 re-baseline at 4c55ecd on 2026-10-08)</w:t>
       </w:r>
       <w:r>
         <w:rPr>
@@ -2250,7 +2237,6 @@
           <w:sz w:val="21"/>
           <w:szCs w:val="21"/>
         </w:rPr>
-        <w:t xml:space="preserve">Verified frontend inventory (evidence: Big Pickle map; re-confirmed against the repository at c51f3f1)</w:t>
       </w:r>
     </w:p>
     <w:tbl>
@@ -7737,7 +7723,7 @@
                 <w:sz w:val="18"/>
                 <w:szCs w:val="18"/>
               </w:rPr>
-              <w:t xml:space="preserve">DONE — live, health-gated; verified: compose passes no CORS_ORIGINS to the backend, which defaults to localhost:3000</w:t>
+              <w:t>DONE — live, health-gated; re-baseline verified: the staging compose now passes CORS_ORIGINS=https://openlearn-web-staging.duckdns.org,http://localhost:3000 to the backend container, resolving the previously missing passthrough</w:t>
             </w:r>
           </w:p>
         </w:tc>
@@ -7797,7 +7783,7 @@
                 <w:sz w:val="18"/>
                 <w:szCs w:val="18"/>
               </w:rPr>
-              <w:t xml:space="preserve">Confirm CORS allows the web origin (VERIFY; fix is an infra-owned compose edit + restart)</w:t>
+              <w:t>Confirm the CORS preflight against the live staging API in Batch 0.1 (a confirmation, not an investigation); the infra compose edit is no longer expected</w:t>
             </w:r>
           </w:p>
         </w:tc>
@@ -7862,7 +7848,7 @@
                 <w:sz w:val="18"/>
                 <w:szCs w:val="18"/>
               </w:rPr>
-              <w:t xml:space="preserve">NOT FRONTEND — no reachable backend</w:t>
+              <w:t>NOT FRONTEND — no reachable HTTP surface (re-verified at 4c55ecd: still zero AI-consumer endpoints)</w:t>
             </w:r>
           </w:p>
         </w:tc>
@@ -7987,7 +7973,7 @@
                 <w:sz w:val="18"/>
                 <w:szCs w:val="18"/>
               </w:rPr>
-              <w:t xml:space="preserve">MISSING frontend; backend always fails materials</w:t>
+              <w:t>MISSING frontend; backend pipeline is now REAL and staging-proven (AI Week 7–8: seeded PDFs observed pending → processing → ready on staging)</w:t>
             </w:r>
           </w:p>
         </w:tc>
@@ -8017,7 +8003,7 @@
                 <w:sz w:val="18"/>
                 <w:szCs w:val="18"/>
               </w:rPr>
-              <w:t xml:space="preserve">Deferred</w:t>
+              <w:t>Deferred (stretch)</w:t>
             </w:r>
           </w:p>
         </w:tc>
@@ -8047,7 +8033,7 @@
                 <w:sz w:val="18"/>
                 <w:szCs w:val="18"/>
               </w:rPr>
-              <w:t xml:space="preserve">Stretch flow only if the backend seam lands before Gate C</w:t>
+              <w:t>The Section 6 trigger has fired; the minimal upload + status view is the eligible Gate C stretch decision, plus an instructor test user on staging</w:t>
             </w:r>
           </w:p>
         </w:tc>
@@ -10413,7 +10399,7 @@
                 <w:sz w:val="18"/>
                 <w:szCs w:val="18"/>
               </w:rPr>
-              <w:t xml:space="preserve">No</w:t>
+              <w:t>Backend yes (staging-proven); frontend no</w:t>
             </w:r>
           </w:p>
         </w:tc>
@@ -10443,7 +10429,7 @@
                 <w:sz w:val="18"/>
                 <w:szCs w:val="18"/>
               </w:rPr>
-              <w:t xml:space="preserve">n/a</w:t>
+              <w:t>Yes — for the backend flow</w:t>
             </w:r>
           </w:p>
         </w:tc>
@@ -10473,7 +10459,7 @@
                 <w:sz w:val="18"/>
                 <w:szCs w:val="18"/>
               </w:rPr>
-              <w:t xml:space="preserve">Deferred — stretch only if the backend seam lands (Section 6)</w:t>
+              <w:t>None mandatory — the deferral trigger has fired (Section 6); requires an instructor-role demo user</w:t>
             </w:r>
           </w:p>
         </w:tc>
@@ -10503,7 +10489,7 @@
                 <w:sz w:val="18"/>
                 <w:szCs w:val="18"/>
               </w:rPr>
-              <w:t xml:space="preserve">Out of scope unless the trigger fires</w:t>
+              <w:t>Stretch: minimal upload + status view only if adopted at the Gate C decision</w:t>
             </w:r>
           </w:p>
         </w:tc>
@@ -10628,7 +10614,7 @@
                 <w:sz w:val="18"/>
                 <w:szCs w:val="18"/>
               </w:rPr>
-              <w:t xml:space="preserve">Not built — no reachable backend</w:t>
+              <w:t>Not built — no reachable HTTP surface (re-baseline verified); the ingestion pipeline is worker-internal and adds none</w:t>
             </w:r>
           </w:p>
         </w:tc>
@@ -10721,7 +10707,7 @@
           <w:sz w:val="24"/>
           <w:szCs w:val="24"/>
         </w:rPr>
-        <w:t xml:space="preserve">The frontend roadmap does not wait for the AI pod. The investigation is unambiguous on the current state: there are </w:t>
+        <w:t>The frontend roadmap does not wait for the AI pod, and the FR-REB-00 re-baseline (2026-10-08) records what the AI pod has since delivered. The HTTP contract still exposes zero AI-consumer endpoints — no chat, quiz, graph, or retrieval routes exist in backend/app/api/ — so nothing in the frontend plan pretends they exist, and no fake AI remains the rule. What changed underneath is the material-processing seam: it is no longer a NotImplementedError stub. The AI Week 7–8 work (merged to staging and verified in this re-baseline) implemented the full pipeline — storage fetch from MinIO, Docling ingestion, PDF-only targeted OCR (Gemini gemini-3.6-flash behind the 50-character text gate), structure-aware chunking (1200/150), BGE-M3 embeddings (1024-dim, L2-normalized), and pgvector persistence committed atomically with the ready transition — and staging runs observed a seeded PDF travel pending → processing → ready in about 54 seconds (B7 final run), with the failure path marking materials failed. The materials REST contract the frontend already knows (upload-url, register returning 202 with material_id and job_id, list, status) is now backed by real asynchronous processing on a dedicated Celery ingestion queue instead of a guaranteed failure. Reasoning through the LiteLLM gateway is staging-proven for the worker (gemini-3.6-flash, budget guard confirmed from the running gateway's configuration) but remains an internal PAL capability: no HTTP route reaches it. Recorded limitations travel with this capability: scanned-PDF OCR is not fully validated (Gemini free-tier quota blocked the scanned fixtures), Langfuse tracing is disabled, and Celery routes/retry finalization remains DevOps-owned (Q4).</w:t>
       </w:r>
       <w:r>
         <w:rPr>
@@ -10734,7 +10720,6 @@
           <w:sz w:val="24"/>
           <w:szCs w:val="24"/>
         </w:rPr>
-        <w:t xml:space="preserve">zero AI-reachable endpoints</w:t>
       </w:r>
       <w:r>
         <w:rPr>
@@ -10747,7 +10732,6 @@
           <w:sz w:val="24"/>
           <w:szCs w:val="24"/>
         </w:rPr>
-        <w:t xml:space="preserve">. The PAL stack (Gemini OCR, BGE-M3 embeddings, the Postgres vector store, the reasoning providers) is real code but dead from the HTTP contract's perspective, and the material processing seam raises NotImplementedError — every uploaded material deterministically ends in the failed state. Nothing in the frontend plan depends on any of this, and nothing pretends it exists.</w:t>
       </w:r>
     </w:p>
     <w:p>
@@ -11074,7 +11058,7 @@
                 <w:sz w:val="19"/>
                 <w:szCs w:val="19"/>
               </w:rPr>
-              <w:t xml:space="preserve">Documented and backend-tested, but no UI now — the pipeline behind it always fails. If the seam lands, a minimal upload + status view becomes a stretch flow (Gate C decision)</w:t>
+              <w:t>Documented, backend-tested, and — since AI Week 7–8 — staging-proven: a registered material now really processes to ready or failed. The re-baseline confirms the old trigger has fired, so a minimal upload + status view is the eligible Gate C stretch decision (not Week 8 closure work); it needs an instructor-role user on staging</w:t>
             </w:r>
           </w:p>
         </w:tc>
@@ -11139,7 +11123,7 @@
                 <w:sz w:val="19"/>
                 <w:szCs w:val="19"/>
               </w:rPr>
-              <w:t xml:space="preserve">Material processing seam (NotImplementedError), chat/quiz/graph capability, LiteLLM gateway (ADR-0005, unimplemented)</w:t>
+              <w:t>Chat/quiz/graph capability (no HTTP surface), LiteLLM gateway reachable only by the worker (reasoning internal; gemini-3.6-flash proven on staging), Langfuse tracing disabled, Celery routes/retry finalization (Q4), scanned-PDF OCR validation</w:t>
             </w:r>
           </w:p>
         </w:tc>
@@ -11169,7 +11153,7 @@
                 <w:sz w:val="19"/>
                 <w:szCs w:val="19"/>
               </w:rPr>
-              <w:t xml:space="preserve">No frontend work, no fake AI, no speculative integration points. Single trigger: a working seam plus an instructor test user in staging before Gate C</w:t>
+              <w:t>No frontend work, no fake AI, no speculative integration points. The seam trigger has fired (2026-10-08 evidence); an instructor test user on staging is the remaining Gate C precondition for the stretch flow</w:t>
             </w:r>
           </w:p>
         </w:tc>
@@ -11287,7 +11271,7 @@
           <w:sz w:val="24"/>
           <w:szCs w:val="24"/>
         </w:rPr>
-        <w:t xml:space="preserve">Three backend-owned defects are flagged upstream rather than absorbed into frontend scope. First, </w:t>
+        <w:t>Backend-owned findings are flagged upstream rather than absorbed into frontend scope; the re-baseline updates two of the three recorded at v1.1. First, course listing is still not owner-scoped: any authenticated user sees every course in the database, which is an authorization defect on the backend even though it incidentally makes demo data visible to the demo account. Second, staging CORS is resolved at the configuration level: the staging compose now passes CORS_ORIGINS=https://openlearn-web-staging.duckdns.org,http://localhost:3000 into the backend container, so the previously missing passthrough no longer blocks the staging web origin; the Batch 0.1 preflight is kept as a live confirmation, and the compose-edit escalation is retired unless the live check disagrees. Third, the split identity-resolution policy (the /auth/me route provisions the local user while every /v1 route 404s for an unknown identity) is unchanged and remains mitigated in the frontend because course and profile queries gate on the me query succeeding; the mitigation is preserved, not redesigned.</w:t>
       </w:r>
       <w:r>
         <w:rPr>
@@ -11300,7 +11284,6 @@
           <w:sz w:val="24"/>
           <w:szCs w:val="24"/>
         </w:rPr>
-        <w:t xml:space="preserve">course listing is not owner-scoped</w:t>
       </w:r>
       <w:r>
         <w:rPr>
@@ -11313,7 +11296,6 @@
           <w:sz w:val="24"/>
           <w:szCs w:val="24"/>
         </w:rPr>
-        <w:t xml:space="preserve">: any authenticated user sees every course in the database, which is an authorization defect on the backend even though it incidentally makes demo data visible to the demo account. Second, staging CORS configuration (verified): the staging compose passes no CORS_ORIGINS into the backend container at all, so the backend keeps its localhost:3000 default and blocks the staging web origin — an out-of-band environment entry cannot reach the container, so the fix is a compose passthrough edit plus backend restart, owned by infra; the actual answer is confirmed by the preflight in Batch 0.1. Third, the split identity-resolution policy (the /auth/me route provisions the local user while every /v1 route 404s for an unknown identity) is already mitigated in the frontend because course and profile queries gate on the me query succeeding; the mitigation is preserved, not redesigned.</w:t>
       </w:r>
     </w:p>
     <w:p>
@@ -12480,7 +12462,7 @@
           <w:sz w:val="24"/>
           <w:szCs w:val="24"/>
         </w:rPr>
-        <w:t xml:space="preserve">Phase 0 exists because the evidence base for this roadmap is an investigation, not a live console. Every machine-checkable claim is re-run against the actual repository, and the scope is frozen so no later phase renegotiates it. The output is small and decisive — a baseline record, a confirmed-or-refuted F5, and the frozen classification this document already carries. Nothing in Phase 0 changes application code.</w:t>
+        <w:t>Phase 0 exists because the evidence base for this roadmap is an investigation, not a live console. Every machine-checkable claim is re-run against the actual repository, and the scope is frozen so no later phase renegotiates it. The FR-REB-00 re-baseline (2026-10-08) has already re-verified the repository-level claims at HEAD 4c55ecd — frontend code unchanged since c51f3f1, findings intact, backend/infra reality reconciled into this document — so Batch 0.1 remains the runtime pass it always was: the six scripts, the E2E specs, the live F5 datetime answer, and the staging CORS preflight confirmation. The output is small and decisive — a baseline record, a confirmed-or-refuted F5, and the frozen classification this document already carries. Nothing in Phase 0 changes application code.</w:t>
       </w:r>
     </w:p>
     <w:p>
@@ -12986,7 +12968,7 @@
                 <w:sz w:val="18"/>
                 <w:szCs w:val="18"/>
               </w:rPr>
-              <w:t xml:space="preserve">VERIFY F5: does created_at carry an offset? VERIFY staging CORS: preflight answer for the web origin. All six scripts exit 0 or failures documented as Phase 1 inputs.</w:t>
+              <w:t>VERIFY F5: does created_at carry an offset? CONFIRM staging CORS: the compose now passes the web origin (re-baseline evidence); the preflight is a live confirmation, not an investigation. All six scripts exit 0 or failures documented as Phase 1 inputs.</w:t>
             </w:r>
           </w:p>
         </w:tc>
@@ -26285,7 +26267,7 @@
                 <w:sz w:val="18"/>
                 <w:szCs w:val="18"/>
               </w:rPr>
-              <w:t xml:space="preserve">Deferred with a trigger, not built: the backend seam raises NotImplementedError, so every material ends failed; a demo of guaranteed failure is worse than no demo</w:t>
+              <w:t>Deferred with a trigger — and the trigger has now fired: AI Week 7–8 implemented and staging-proved the seam (a material reaches ready). It stays unbuilt until the Gate C stretch decision adopts the minimal upload + status view; a demo of a pipeline the frontend has never exercised is not added speculatively before that decision</w:t>
             </w:r>
           </w:p>
         </w:tc>
@@ -26350,7 +26332,7 @@
                 <w:sz w:val="18"/>
                 <w:szCs w:val="18"/>
               </w:rPr>
-              <w:t xml:space="preserve">Zero AI-reachable endpoints; building UI against nothing either fakes behavior or ships dead screens</w:t>
+              <w:t>Still zero AI-consumer HTTP endpoints (re-verified at 4c55ecd); the new ingestion pipeline is worker-internal and adds no user-facing surface; building UI against nothing either fakes behavior or ships dead screens</w:t>
             </w:r>
           </w:p>
         </w:tc>
@@ -27145,7 +27127,7 @@
                 <w:sz w:val="18"/>
                 <w:szCs w:val="18"/>
               </w:rPr>
-              <w:t xml:space="preserve">Week 8 mapping — ANSWERED with evidence: the 44-week plan's Week 8 expects an upload-to-status-ready E2E flow the dead materials seam cannot deliver, plus project-level items outside frontend scope; the closure set in Section 4 covers the achievable frontend meaning and completes the closure doc's pending-verification list. Delta recorded in the progress ledger; needs the team lead's confirmation so the claim lands where the plan expects it.</w:t>
+              <w:t>Week 8 mapping — SUPERSEDED BY THE RE-BASELINE: the AI/ML pod closed Weeks 7–8 (batches B0–B11) and staging merged the work (PR #77), so the question of whether the dead seam can deliver the plan's Week 8 E2E flow no longer blocks anything. The historical delta (the plan expected an upload-to-status-ready flow; the closure set covers the achievable frontend meaning) is recorded in the progress ledger for the record</w:t>
             </w:r>
           </w:p>
         </w:tc>
@@ -27205,7 +27187,7 @@
                 <w:sz w:val="18"/>
                 <w:szCs w:val="18"/>
               </w:rPr>
-              <w:t xml:space="preserve">Confirm the recorded delta (progress ledger, Week 8 section); adjust the closure set only if the plan demands more</w:t>
+              <w:t>No action required — the re-baseline absorbed the question; keep the ledger record for history</w:t>
             </w:r>
           </w:p>
         </w:tc>
@@ -27395,7 +27377,7 @@
                 <w:sz w:val="18"/>
                 <w:szCs w:val="18"/>
               </w:rPr>
-              <w:t xml:space="preserve">Staging CORS — SHARPENED by verification: the staging compose passes no CORS_ORIGINS into the backend container at all, and the backend defaults to localhost:3000, so an out-of-band env entry alone cannot reach it. The fix is a compose passthrough edit plus backend restart, infra-owned. Will infra apply it before the demo window?</w:t>
+              <w:t>Staging CORS — LARGELY RESOLVED BY THE RE-BASELINE: infra/docker-compose.staging.yml now passes CORS_ORIGINS=https://openlearn-web-staging.duckdns.org,http://localhost:3000 into the backend container, so the web origin is configured. Verified from the compose file at 4c55ecd, not from a live preflight</w:t>
             </w:r>
           </w:p>
         </w:tc>
@@ -27455,7 +27437,7 @@
                 <w:sz w:val="18"/>
                 <w:szCs w:val="18"/>
               </w:rPr>
-              <w:t xml:space="preserve">Batch 0.1 preflight confirms; if blocked, raise the compose-passthrough task and fall back to a local demo</w:t>
+              <w:t>Batch 0.1 preflight confirms live; if the live check disagrees with the compose, re-raise as an infra task and fall back to a local demo</w:t>
             </w:r>
           </w:p>
         </w:tc>
@@ -27770,7 +27752,7 @@
                 <w:sz w:val="18"/>
                 <w:szCs w:val="18"/>
               </w:rPr>
-              <w:t xml:space="preserve">Will the AI pod land the processing seam and an instructor test user before Gate C? (Verification re-confirmed: zero AI route files in backend/app/api/.)</w:t>
+              <w:t>ANSWERED BY THE RE-BASELINE: the AI pod landed the processing seam and it is staging-proven (H4 delivered to the frontend pod on 2026-10-08; pending → processing → ready observed on staging in ~54s for born-digital PDFs). Zero AI-consumer HTTP endpoints still exist</w:t>
             </w:r>
           </w:p>
         </w:tc>
@@ -27830,7 +27812,7 @@
                 <w:sz w:val="18"/>
                 <w:szCs w:val="18"/>
               </w:rPr>
-              <w:t xml:space="preserve">If yes, the materials stretch flow is added at Gate C; if no, it stays deferred</w:t>
+              <w:t>The materials stretch flow is now the Gate C decision (adopt or defer); the remaining precondition is an instructor test user on staging</w:t>
             </w:r>
           </w:p>
         </w:tc>

</xml_diff>